<commit_message>
Fix Tr4 header: add floating BM logo matching master template layout
NC logo inline left, BM logo anchored right using exact EMU dimensions
and position offsets from the Tr3 master template. All future SOPs
generated from this script will have the correct dual-logo header.

Co-Authored-By: Claude Sonnet 4.6 <noreply@anthropic.com>
</commit_message>
<xml_diff>
--- a/Standard Operating Procedures/Tr4 Mutant Vehicle Statement of Intent.docx
+++ b/Standard Operating Procedures/Tr4 Mutant Vehicle Statement of Intent.docx
@@ -9,7 +9,7 @@
       <w:r>
         <w:drawing>
           <wp:inline xmlns:a="http://schemas.openxmlformats.org/drawingml/2006/main" xmlns:pic="http://schemas.openxmlformats.org/drawingml/2006/picture">
-            <wp:extent cx="3199845" cy="914400"/>
+            <wp:extent cx="2879860" cy="822960"/>
             <wp:docPr id="1" name="Picture 1"/>
             <wp:cNvGraphicFramePr>
               <a:graphicFrameLocks noChangeAspect="1"/>
@@ -30,7 +30,7 @@
                   <pic:spPr>
                     <a:xfrm>
                       <a:off x="0" y="0"/>
-                      <a:ext cx="3199845" cy="914400"/>
+                      <a:ext cx="2879860" cy="822960"/>
                     </a:xfrm>
                     <a:prstGeom prst="rect"/>
                   </pic:spPr>
@@ -38,6 +38,54 @@
               </a:graphicData>
             </a:graphic>
           </wp:inline>
+        </w:drawing>
+      </w:r>
+      <w:r>
+        <w:drawing>
+          <wp:anchor xmlns:a="http://schemas.openxmlformats.org/drawingml/2006/main" xmlns:pic="http://schemas.openxmlformats.org/drawingml/2006/picture" distT="0" distB="0" distL="0" distR="0" simplePos="0" relativeHeight="3" behindDoc="0" locked="0" layoutInCell="0" allowOverlap="1">
+            <wp:simplePos x="0" y="0"/>
+            <wp:positionH relativeFrom="column">
+              <wp:posOffset>4833620</wp:posOffset>
+            </wp:positionH>
+            <wp:positionV relativeFrom="paragraph">
+              <wp:posOffset>-123825</wp:posOffset>
+            </wp:positionV>
+            <wp:extent cx="1529080" cy="1091565"/>
+            <wp:effectExtent l="0" t="0" r="0" b="0"/>
+            <wp:wrapSquare wrapText="largest"/>
+            <wp:docPr id="2" name="BMlogo"/>
+            <wp:cNvGraphicFramePr>
+              <a:graphicFrameLocks noChangeAspect="1"/>
+            </wp:cNvGraphicFramePr>
+            <a:graphic>
+              <a:graphicData uri="http://schemas.openxmlformats.org/drawingml/2006/picture">
+                <pic:pic>
+                  <pic:nvPicPr>
+                    <pic:cNvPr id="2" name="BMlogo"/>
+                    <pic:cNvPicPr>
+                      <a:picLocks noChangeAspect="1" noChangeArrowheads="1"/>
+                    </pic:cNvPicPr>
+                  </pic:nvPicPr>
+                  <pic:blipFill>
+                    <a:blip r:embed="rId10"/>
+                    <a:stretch>
+                      <a:fillRect/>
+                    </a:stretch>
+                  </pic:blipFill>
+                  <pic:spPr bwMode="auto">
+                    <a:xfrm>
+                      <a:off x="0" y="0"/>
+                      <a:ext cx="1529080" cy="1091565"/>
+                    </a:xfrm>
+                    <a:prstGeom prst="rect">
+                      <a:avLst/>
+                    </a:prstGeom>
+                    <a:noFill/>
+                  </pic:spPr>
+                </pic:pic>
+              </a:graphicData>
+            </a:graphic>
+          </wp:anchor>
         </w:drawing>
       </w:r>
     </w:p>
@@ -820,7 +868,7 @@
       </w:r>
     </w:p>
     <w:sectPr>
-      <w:footerReference w:type="default" r:id="rId10"/>
+      <w:footerReference w:type="default" r:id="rId11"/>
       <w:pgSz w:w="12240" w:h="15840"/>
       <w:pgMar w:top="720" w:right="1440" w:bottom="1080" w:left="1440" w:header="720" w:footer="720" w:gutter="0"/>
       <w:cols w:space="720"/>

</xml_diff>